<commit_message>
feat(evidence): scanned-picture evidence_docs with review queue (Phase 2d)
- Prisma EvidenceDoc + enums (kind/status), indexed hash for duplicate detection
- POST /api/evidence (Pending only, duplicate flags NeedsReview) + GET queue
- PATCH /api/evidence/[id] owner/reviewer accept-reject, OCR draft-only
- PRD: data-model row + 7.13 capture/review/retention spec
</commit_message>
<xml_diff>
--- a/ViewProof Product Requirements Document.docx
+++ b/ViewProof Product Requirements Document.docx
@@ -963,6 +963,28 @@
           <w:p>
             <w:r>
               <w:t>id, booking_id, template, wamid, direction, status, at</w:t>
+            </w:r>
+          </w:p>
+        </w:tc>
+      </w:tr>
+      <w:tr>
+        <w:tc>
+          <w:tcPr>
+            <w:tcW w:type="dxa" w:w="4320"/>
+          </w:tcPr>
+          <w:p>
+            <w:r>
+              <w:t>evidence_docs</w:t>
+            </w:r>
+          </w:p>
+        </w:tc>
+        <w:tc>
+          <w:tcPr>
+            <w:tcW w:type="dxa" w:w="4320"/>
+          </w:tcPr>
+          <w:p>
+            <w:r>
+              <w:t>id, listing_id, kind (mandate/photo/letter/receipt/other), image_url, hash, taken_at, uploaded_by, status (Pending/Accepted/Rejected), ocr_text/confidence (draft only), reviewed_at</w:t>
             </w:r>
           </w:p>
         </w:tc>
@@ -2137,6 +2159,54 @@
         <w:t>ViewProof does not promise certainty where certainty does not exist. It makes agency responsibility, listing freshness, viewing coordination, and evidence status visible to everyone involved.</w:t>
       </w:r>
     </w:p>
+    <w:p>
+      <w:pPr>
+        <w:pStyle w:val="Heading2"/>
+      </w:pPr>
+      <w:r>
+        <w:t>7.13 Evidence docs — scanned pictures (new v1.1.1)</w:t>
+      </w:r>
+    </w:p>
+    <w:p>
+      <w:pPr>
+        <w:pStyle w:val="ListBullet"/>
+      </w:pPr>
+      <w:r>
+        <w:t>In-app camera only in MVP (no gallery); PWA compresses to WebP ≤800KB, strips GPS, keeps takenAt; offline queue with will-sync notice.</w:t>
+      </w:r>
+    </w:p>
+    <w:p>
+      <w:pPr>
+        <w:pStyle w:val="ListBullet"/>
+      </w:pPr>
+      <w:r>
+        <w:t>POST /api/evidence always Pending; SHA-256 hash duplicate across listings auto-flags listing NeedsReview.</w:t>
+      </w:r>
+    </w:p>
+    <w:p>
+      <w:pPr>
+        <w:pStyle w:val="ListBullet"/>
+      </w:pPr>
+      <w:r>
+        <w:t>PATCH /api/evidence/[id] owner/reviewer only: accept keeps status, reject sets NeedsReview. OCR text stored as draft, needs per-field human approval; never publishes directly.</w:t>
+      </w:r>
+    </w:p>
+    <w:p>
+      <w:pPr>
+        <w:pStyle w:val="ListBullet"/>
+      </w:pPr>
+      <w:r>
+        <w:t>Buyer sees label + date only (Access evidence submitted on [date]); scans never public. Bytes retained 12 months then deleted; audit keeps who/when.</w:t>
+      </w:r>
+    </w:p>
+    <w:p>
+      <w:pPr>
+        <w:pStyle w:val="ListBullet"/>
+      </w:pPr>
+      <w:r>
+        <w:t>On-screen guide: fill frame, no shadow, 4 corners visible; blur/glare triggers retake prompt.</w:t>
+      </w:r>
+    </w:p>
     <w:sectPr>
       <w:pgSz w:w="12240" w:h="15840"/>
       <w:pgMar w:top="1440" w:right="1800" w:bottom="1440" w:left="1800" w:header="720" w:footer="720" w:gutter="0"/>

</xml_diff>